<commit_message>
got rid of non html pages
</commit_message>
<xml_diff>
--- a/airc-sss/SSS_Domain_Meeting_Agenda_June18.docx
+++ b/airc-sss/SSS_Domain_Meeting_Agenda_June18.docx
@@ -1833,6 +1833,588 @@
         <w:t xml:space="preserve">-&gt; decision above + Student Partnership subcommittee.</w:t>
       </w:r>
     </w:p>
+    <w:p>
+      <w:pPr>
+        <w:pStyle w:val="Heading1"/>
+      </w:pPr>
+      <w:r>
+        <w:rPr>
+          <w:color w:val="6B3A5B"/>
+        </w:rPr>
+        <w:t xml:space="preserve">Project timeline (high level)</w:t>
+      </w:r>
+    </w:p>
+    <w:p>
+      <w:pPr>
+        <w:spacing w:after="110" w:line="272"/>
+      </w:pPr>
+      <w:r>
+        <w:t xml:space="preserve">Realistic sequencing. Most people are away over summer, so fieldwork starts in fall.</w:t>
+      </w:r>
+    </w:p>
+    <w:tbl>
+      <w:tblPr>
+        <w:tblW w:type="dxa" w:w="9360"/>
+        <w:tblBorders>
+          <w:top w:val="single" w:color="auto" w:sz="4"/>
+          <w:left w:val="single" w:color="auto" w:sz="4"/>
+          <w:bottom w:val="single" w:color="auto" w:sz="4"/>
+          <w:right w:val="single" w:color="auto" w:sz="4"/>
+          <w:insideH w:val="single" w:color="auto" w:sz="4"/>
+          <w:insideV w:val="single" w:color="auto" w:sz="4"/>
+        </w:tblBorders>
+      </w:tblPr>
+      <w:tblGrid>
+        <w:gridCol w:w="2300"/>
+        <w:gridCol w:w="1700"/>
+        <w:gridCol w:w="5360"/>
+      </w:tblGrid>
+      <w:tr>
+        <w:trPr>
+          <w:tblHeader/>
+        </w:trPr>
+        <w:tc>
+          <w:tcPr>
+            <w:tcW w:type="dxa" w:w="2300"/>
+            <w:tcBorders>
+              <w:top w:val="single" w:color="CCCCCC" w:sz="1"/>
+              <w:left w:val="single" w:color="CCCCCC" w:sz="1"/>
+              <w:bottom w:val="single" w:color="CCCCCC" w:sz="1"/>
+              <w:right w:val="single" w:color="CCCCCC" w:sz="1"/>
+            </w:tcBorders>
+            <w:shd w:fill="55663F" w:val="clear"/>
+            <w:tcMar>
+              <w:top w:type="dxa" w:w="50"/>
+              <w:left w:type="dxa" w:w="90"/>
+              <w:bottom w:type="dxa" w:w="50"/>
+              <w:right w:type="dxa" w:w="90"/>
+            </w:tcMar>
+          </w:tcPr>
+          <w:p>
+            <w:r>
+              <w:rPr>
+                <w:b/>
+                <w:bCs/>
+                <w:color w:val="FFFFFF"/>
+                <w:sz w:val="19"/>
+                <w:szCs w:val="19"/>
+              </w:rPr>
+              <w:t xml:space="preserve">Phase</w:t>
+            </w:r>
+          </w:p>
+        </w:tc>
+        <w:tc>
+          <w:tcPr>
+            <w:tcW w:type="dxa" w:w="1700"/>
+            <w:tcBorders>
+              <w:top w:val="single" w:color="CCCCCC" w:sz="1"/>
+              <w:left w:val="single" w:color="CCCCCC" w:sz="1"/>
+              <w:bottom w:val="single" w:color="CCCCCC" w:sz="1"/>
+              <w:right w:val="single" w:color="CCCCCC" w:sz="1"/>
+            </w:tcBorders>
+            <w:shd w:fill="55663F" w:val="clear"/>
+            <w:tcMar>
+              <w:top w:type="dxa" w:w="50"/>
+              <w:left w:type="dxa" w:w="90"/>
+              <w:bottom w:type="dxa" w:w="50"/>
+              <w:right w:type="dxa" w:w="90"/>
+            </w:tcMar>
+          </w:tcPr>
+          <w:p>
+            <w:r>
+              <w:rPr>
+                <w:b/>
+                <w:bCs/>
+                <w:color w:val="FFFFFF"/>
+                <w:sz w:val="19"/>
+                <w:szCs w:val="19"/>
+              </w:rPr>
+              <w:t xml:space="preserve">Window</w:t>
+            </w:r>
+          </w:p>
+        </w:tc>
+        <w:tc>
+          <w:tcPr>
+            <w:tcW w:type="dxa" w:w="5360"/>
+            <w:tcBorders>
+              <w:top w:val="single" w:color="CCCCCC" w:sz="1"/>
+              <w:left w:val="single" w:color="CCCCCC" w:sz="1"/>
+              <w:bottom w:val="single" w:color="CCCCCC" w:sz="1"/>
+              <w:right w:val="single" w:color="CCCCCC" w:sz="1"/>
+            </w:tcBorders>
+            <w:shd w:fill="55663F" w:val="clear"/>
+            <w:tcMar>
+              <w:top w:type="dxa" w:w="50"/>
+              <w:left w:type="dxa" w:w="90"/>
+              <w:bottom w:type="dxa" w:w="50"/>
+              <w:right w:type="dxa" w:w="90"/>
+            </w:tcMar>
+          </w:tcPr>
+          <w:p>
+            <w:r>
+              <w:rPr>
+                <w:b/>
+                <w:bCs/>
+                <w:color w:val="FFFFFF"/>
+                <w:sz w:val="19"/>
+                <w:szCs w:val="19"/>
+              </w:rPr>
+              <w:t xml:space="preserve">Focus</w:t>
+            </w:r>
+          </w:p>
+        </w:tc>
+      </w:tr>
+      <w:tr>
+        <w:tc>
+          <w:tcPr>
+            <w:tcW w:type="dxa" w:w="2300"/>
+            <w:tcBorders>
+              <w:top w:val="single" w:color="CCCCCC" w:sz="1"/>
+              <w:left w:val="single" w:color="CCCCCC" w:sz="1"/>
+              <w:bottom w:val="single" w:color="CCCCCC" w:sz="1"/>
+              <w:right w:val="single" w:color="CCCCCC" w:sz="1"/>
+            </w:tcBorders>
+            <w:shd w:fill="F2ECF1" w:val="clear"/>
+            <w:tcMar>
+              <w:top w:type="dxa" w:w="50"/>
+              <w:left w:type="dxa" w:w="90"/>
+              <w:bottom w:type="dxa" w:w="50"/>
+              <w:right w:type="dxa" w:w="90"/>
+            </w:tcMar>
+          </w:tcPr>
+          <w:p>
+            <w:r>
+              <w:rPr>
+                <w:b/>
+                <w:bCs/>
+                <w:color w:val="2B2B2B"/>
+                <w:sz w:val="19"/>
+                <w:szCs w:val="19"/>
+              </w:rPr>
+              <w:t xml:space="preserve">Discovery &amp; setup</w:t>
+            </w:r>
+          </w:p>
+        </w:tc>
+        <w:tc>
+          <w:tcPr>
+            <w:tcW w:type="dxa" w:w="1700"/>
+            <w:tcBorders>
+              <w:top w:val="single" w:color="CCCCCC" w:sz="1"/>
+              <w:left w:val="single" w:color="CCCCCC" w:sz="1"/>
+              <w:bottom w:val="single" w:color="CCCCCC" w:sz="1"/>
+              <w:right w:val="single" w:color="CCCCCC" w:sz="1"/>
+            </w:tcBorders>
+            <w:tcMar>
+              <w:top w:type="dxa" w:w="50"/>
+              <w:left w:type="dxa" w:w="90"/>
+              <w:bottom w:type="dxa" w:w="50"/>
+              <w:right w:type="dxa" w:w="90"/>
+            </w:tcMar>
+          </w:tcPr>
+          <w:p>
+            <w:r>
+              <w:rPr>
+                <w:b w:val="false"/>
+                <w:bCs w:val="false"/>
+                <w:color w:val="2B2B2B"/>
+                <w:sz w:val="19"/>
+                <w:szCs w:val="19"/>
+              </w:rPr>
+              <w:t xml:space="preserve">Summer 2026</w:t>
+            </w:r>
+          </w:p>
+        </w:tc>
+        <w:tc>
+          <w:tcPr>
+            <w:tcW w:type="dxa" w:w="5360"/>
+            <w:tcBorders>
+              <w:top w:val="single" w:color="CCCCCC" w:sz="1"/>
+              <w:left w:val="single" w:color="CCCCCC" w:sz="1"/>
+              <w:bottom w:val="single" w:color="CCCCCC" w:sz="1"/>
+              <w:right w:val="single" w:color="CCCCCC" w:sz="1"/>
+            </w:tcBorders>
+            <w:tcMar>
+              <w:top w:type="dxa" w:w="50"/>
+              <w:left w:type="dxa" w:w="90"/>
+              <w:bottom w:type="dxa" w:w="50"/>
+              <w:right w:type="dxa" w:w="90"/>
+            </w:tcMar>
+          </w:tcPr>
+          <w:p>
+            <w:r>
+              <w:rPr>
+                <w:b w:val="false"/>
+                <w:bCs w:val="false"/>
+                <w:color w:val="2B2B2B"/>
+                <w:sz w:val="19"/>
+                <w:szCs w:val="19"/>
+              </w:rPr>
+              <w:t xml:space="preserve">Finalize the study kit, recruit testers (employees role-playing, student government, work-study, design-studio students), pilot the tool. Setup and recruiting only while people are away.</w:t>
+            </w:r>
+          </w:p>
+        </w:tc>
+      </w:tr>
+      <w:tr>
+        <w:tc>
+          <w:tcPr>
+            <w:tcW w:type="dxa" w:w="2300"/>
+            <w:tcBorders>
+              <w:top w:val="single" w:color="CCCCCC" w:sz="1"/>
+              <w:left w:val="single" w:color="CCCCCC" w:sz="1"/>
+              <w:bottom w:val="single" w:color="CCCCCC" w:sz="1"/>
+              <w:right w:val="single" w:color="CCCCCC" w:sz="1"/>
+            </w:tcBorders>
+            <w:shd w:fill="F2ECF1" w:val="clear"/>
+            <w:tcMar>
+              <w:top w:type="dxa" w:w="50"/>
+              <w:left w:type="dxa" w:w="90"/>
+              <w:bottom w:type="dxa" w:w="50"/>
+              <w:right w:type="dxa" w:w="90"/>
+            </w:tcMar>
+          </w:tcPr>
+          <w:p>
+            <w:r>
+              <w:rPr>
+                <w:b/>
+                <w:bCs/>
+                <w:color w:val="2B2B2B"/>
+                <w:sz w:val="19"/>
+                <w:szCs w:val="19"/>
+              </w:rPr>
+              <w:t xml:space="preserve">Fieldwork</w:t>
+            </w:r>
+          </w:p>
+        </w:tc>
+        <w:tc>
+          <w:tcPr>
+            <w:tcW w:type="dxa" w:w="1700"/>
+            <w:tcBorders>
+              <w:top w:val="single" w:color="CCCCCC" w:sz="1"/>
+              <w:left w:val="single" w:color="CCCCCC" w:sz="1"/>
+              <w:bottom w:val="single" w:color="CCCCCC" w:sz="1"/>
+              <w:right w:val="single" w:color="CCCCCC" w:sz="1"/>
+            </w:tcBorders>
+            <w:tcMar>
+              <w:top w:type="dxa" w:w="50"/>
+              <w:left w:type="dxa" w:w="90"/>
+              <w:bottom w:type="dxa" w:w="50"/>
+              <w:right w:type="dxa" w:w="90"/>
+            </w:tcMar>
+          </w:tcPr>
+          <w:p>
+            <w:r>
+              <w:rPr>
+                <w:b w:val="false"/>
+                <w:bCs w:val="false"/>
+                <w:color w:val="2B2B2B"/>
+                <w:sz w:val="19"/>
+                <w:szCs w:val="19"/>
+              </w:rPr>
+              <w:t xml:space="preserve">Fall 2026</w:t>
+            </w:r>
+          </w:p>
+        </w:tc>
+        <w:tc>
+          <w:tcPr>
+            <w:tcW w:type="dxa" w:w="5360"/>
+            <w:tcBorders>
+              <w:top w:val="single" w:color="CCCCCC" w:sz="1"/>
+              <w:left w:val="single" w:color="CCCCCC" w:sz="1"/>
+              <w:bottom w:val="single" w:color="CCCCCC" w:sz="1"/>
+              <w:right w:val="single" w:color="CCCCCC" w:sz="1"/>
+            </w:tcBorders>
+            <w:tcMar>
+              <w:top w:type="dxa" w:w="50"/>
+              <w:left w:type="dxa" w:w="90"/>
+              <w:bottom w:type="dxa" w:w="50"/>
+              <w:right w:type="dxa" w:w="90"/>
+            </w:tcMar>
+          </w:tcPr>
+          <w:p>
+            <w:r>
+              <w:rPr>
+                <w:b w:val="false"/>
+                <w:bCs w:val="false"/>
+                <w:color w:val="2B2B2B"/>
+                <w:sz w:val="19"/>
+                <w:szCs w:val="19"/>
+              </w:rPr>
+              <w:t xml:space="preserve">Run the personas across colleges; assigned SSS team members and students log barriers through the form.</w:t>
+            </w:r>
+          </w:p>
+        </w:tc>
+      </w:tr>
+      <w:tr>
+        <w:tc>
+          <w:tcPr>
+            <w:tcW w:type="dxa" w:w="2300"/>
+            <w:tcBorders>
+              <w:top w:val="single" w:color="CCCCCC" w:sz="1"/>
+              <w:left w:val="single" w:color="CCCCCC" w:sz="1"/>
+              <w:bottom w:val="single" w:color="CCCCCC" w:sz="1"/>
+              <w:right w:val="single" w:color="CCCCCC" w:sz="1"/>
+            </w:tcBorders>
+            <w:shd w:fill="F2ECF1" w:val="clear"/>
+            <w:tcMar>
+              <w:top w:type="dxa" w:w="50"/>
+              <w:left w:type="dxa" w:w="90"/>
+              <w:bottom w:type="dxa" w:w="50"/>
+              <w:right w:type="dxa" w:w="90"/>
+            </w:tcMar>
+          </w:tcPr>
+          <w:p>
+            <w:r>
+              <w:rPr>
+                <w:b/>
+                <w:bCs/>
+                <w:color w:val="2B2B2B"/>
+                <w:sz w:val="19"/>
+                <w:szCs w:val="19"/>
+              </w:rPr>
+              <w:t xml:space="preserve">Synthesis</w:t>
+            </w:r>
+          </w:p>
+        </w:tc>
+        <w:tc>
+          <w:tcPr>
+            <w:tcW w:type="dxa" w:w="1700"/>
+            <w:tcBorders>
+              <w:top w:val="single" w:color="CCCCCC" w:sz="1"/>
+              <w:left w:val="single" w:color="CCCCCC" w:sz="1"/>
+              <w:bottom w:val="single" w:color="CCCCCC" w:sz="1"/>
+              <w:right w:val="single" w:color="CCCCCC" w:sz="1"/>
+            </w:tcBorders>
+            <w:tcMar>
+              <w:top w:type="dxa" w:w="50"/>
+              <w:left w:type="dxa" w:w="90"/>
+              <w:bottom w:type="dxa" w:w="50"/>
+              <w:right w:type="dxa" w:w="90"/>
+            </w:tcMar>
+          </w:tcPr>
+          <w:p>
+            <w:r>
+              <w:rPr>
+                <w:b w:val="false"/>
+                <w:bCs w:val="false"/>
+                <w:color w:val="2B2B2B"/>
+                <w:sz w:val="19"/>
+                <w:szCs w:val="19"/>
+              </w:rPr>
+              <w:t xml:space="preserve">Winter 2026-27</w:t>
+            </w:r>
+          </w:p>
+        </w:tc>
+        <w:tc>
+          <w:tcPr>
+            <w:tcW w:type="dxa" w:w="5360"/>
+            <w:tcBorders>
+              <w:top w:val="single" w:color="CCCCCC" w:sz="1"/>
+              <w:left w:val="single" w:color="CCCCCC" w:sz="1"/>
+              <w:bottom w:val="single" w:color="CCCCCC" w:sz="1"/>
+              <w:right w:val="single" w:color="CCCCCC" w:sz="1"/>
+            </w:tcBorders>
+            <w:tcMar>
+              <w:top w:type="dxa" w:w="50"/>
+              <w:left w:type="dxa" w:w="90"/>
+              <w:bottom w:type="dxa" w:w="50"/>
+              <w:right w:type="dxa" w:w="90"/>
+            </w:tcMar>
+          </w:tcPr>
+          <w:p>
+            <w:r>
+              <w:rPr>
+                <w:b w:val="false"/>
+                <w:bCs w:val="false"/>
+                <w:color w:val="2B2B2B"/>
+                <w:sz w:val="19"/>
+                <w:szCs w:val="19"/>
+              </w:rPr>
+              <w:t xml:space="preserve">Affinity-map findings, build the AI Opportunity Map, severity-rank the barriers.</w:t>
+            </w:r>
+          </w:p>
+        </w:tc>
+      </w:tr>
+      <w:tr>
+        <w:tc>
+          <w:tcPr>
+            <w:tcW w:type="dxa" w:w="2300"/>
+            <w:tcBorders>
+              <w:top w:val="single" w:color="CCCCCC" w:sz="1"/>
+              <w:left w:val="single" w:color="CCCCCC" w:sz="1"/>
+              <w:bottom w:val="single" w:color="CCCCCC" w:sz="1"/>
+              <w:right w:val="single" w:color="CCCCCC" w:sz="1"/>
+            </w:tcBorders>
+            <w:shd w:fill="F2ECF1" w:val="clear"/>
+            <w:tcMar>
+              <w:top w:type="dxa" w:w="50"/>
+              <w:left w:type="dxa" w:w="90"/>
+              <w:bottom w:type="dxa" w:w="50"/>
+              <w:right w:type="dxa" w:w="90"/>
+            </w:tcMar>
+          </w:tcPr>
+          <w:p>
+            <w:r>
+              <w:rPr>
+                <w:b/>
+                <w:bCs/>
+                <w:color w:val="2B2B2B"/>
+                <w:sz w:val="19"/>
+                <w:szCs w:val="19"/>
+              </w:rPr>
+              <w:t xml:space="preserve">Recommendations &amp; case study</w:t>
+            </w:r>
+          </w:p>
+        </w:tc>
+        <w:tc>
+          <w:tcPr>
+            <w:tcW w:type="dxa" w:w="1700"/>
+            <w:tcBorders>
+              <w:top w:val="single" w:color="CCCCCC" w:sz="1"/>
+              <w:left w:val="single" w:color="CCCCCC" w:sz="1"/>
+              <w:bottom w:val="single" w:color="CCCCCC" w:sz="1"/>
+              <w:right w:val="single" w:color="CCCCCC" w:sz="1"/>
+            </w:tcBorders>
+            <w:tcMar>
+              <w:top w:type="dxa" w:w="50"/>
+              <w:left w:type="dxa" w:w="90"/>
+              <w:bottom w:type="dxa" w:w="50"/>
+              <w:right w:type="dxa" w:w="90"/>
+            </w:tcMar>
+          </w:tcPr>
+          <w:p>
+            <w:r>
+              <w:rPr>
+                <w:b w:val="false"/>
+                <w:bCs w:val="false"/>
+                <w:color w:val="2B2B2B"/>
+                <w:sz w:val="19"/>
+                <w:szCs w:val="19"/>
+              </w:rPr>
+              <w:t xml:space="preserve">Spring 2027</w:t>
+            </w:r>
+          </w:p>
+        </w:tc>
+        <w:tc>
+          <w:tcPr>
+            <w:tcW w:type="dxa" w:w="5360"/>
+            <w:tcBorders>
+              <w:top w:val="single" w:color="CCCCCC" w:sz="1"/>
+              <w:left w:val="single" w:color="CCCCCC" w:sz="1"/>
+              <w:bottom w:val="single" w:color="CCCCCC" w:sz="1"/>
+              <w:right w:val="single" w:color="CCCCCC" w:sz="1"/>
+            </w:tcBorders>
+            <w:tcMar>
+              <w:top w:type="dxa" w:w="50"/>
+              <w:left w:type="dxa" w:w="90"/>
+              <w:bottom w:type="dxa" w:w="50"/>
+              <w:right w:type="dxa" w:w="90"/>
+            </w:tcMar>
+          </w:tcPr>
+          <w:p>
+            <w:r>
+              <w:rPr>
+                <w:b w:val="false"/>
+                <w:bCs w:val="false"/>
+                <w:color w:val="2B2B2B"/>
+                <w:sz w:val="19"/>
+                <w:szCs w:val="19"/>
+              </w:rPr>
+              <w:t xml:space="preserve">Prioritized AI recommendations and pilots; a presentable case study by spring break.</w:t>
+            </w:r>
+          </w:p>
+        </w:tc>
+      </w:tr>
+      <w:tr>
+        <w:tc>
+          <w:tcPr>
+            <w:tcW w:type="dxa" w:w="2300"/>
+            <w:tcBorders>
+              <w:top w:val="single" w:color="CCCCCC" w:sz="1"/>
+              <w:left w:val="single" w:color="CCCCCC" w:sz="1"/>
+              <w:bottom w:val="single" w:color="CCCCCC" w:sz="1"/>
+              <w:right w:val="single" w:color="CCCCCC" w:sz="1"/>
+            </w:tcBorders>
+            <w:shd w:fill="F2ECF1" w:val="clear"/>
+            <w:tcMar>
+              <w:top w:type="dxa" w:w="50"/>
+              <w:left w:type="dxa" w:w="90"/>
+              <w:bottom w:type="dxa" w:w="50"/>
+              <w:right w:type="dxa" w:w="90"/>
+            </w:tcMar>
+          </w:tcPr>
+          <w:p>
+            <w:r>
+              <w:rPr>
+                <w:b/>
+                <w:bCs/>
+                <w:color w:val="2B2B2B"/>
+                <w:sz w:val="19"/>
+                <w:szCs w:val="19"/>
+              </w:rPr>
+              <w:t xml:space="preserve">Present</w:t>
+            </w:r>
+          </w:p>
+        </w:tc>
+        <w:tc>
+          <w:tcPr>
+            <w:tcW w:type="dxa" w:w="1700"/>
+            <w:tcBorders>
+              <w:top w:val="single" w:color="CCCCCC" w:sz="1"/>
+              <w:left w:val="single" w:color="CCCCCC" w:sz="1"/>
+              <w:bottom w:val="single" w:color="CCCCCC" w:sz="1"/>
+              <w:right w:val="single" w:color="CCCCCC" w:sz="1"/>
+            </w:tcBorders>
+            <w:tcMar>
+              <w:top w:type="dxa" w:w="50"/>
+              <w:left w:type="dxa" w:w="90"/>
+              <w:bottom w:type="dxa" w:w="50"/>
+              <w:right w:type="dxa" w:w="90"/>
+            </w:tcMar>
+          </w:tcPr>
+          <w:p>
+            <w:r>
+              <w:rPr>
+                <w:b w:val="false"/>
+                <w:bCs w:val="false"/>
+                <w:color w:val="2B2B2B"/>
+                <w:sz w:val="19"/>
+                <w:szCs w:val="19"/>
+              </w:rPr>
+              <w:t xml:space="preserve">May 2027</w:t>
+            </w:r>
+          </w:p>
+        </w:tc>
+        <w:tc>
+          <w:tcPr>
+            <w:tcW w:type="dxa" w:w="5360"/>
+            <w:tcBorders>
+              <w:top w:val="single" w:color="CCCCCC" w:sz="1"/>
+              <w:left w:val="single" w:color="CCCCCC" w:sz="1"/>
+              <w:bottom w:val="single" w:color="CCCCCC" w:sz="1"/>
+              <w:right w:val="single" w:color="CCCCCC" w:sz="1"/>
+            </w:tcBorders>
+            <w:tcMar>
+              <w:top w:type="dxa" w:w="50"/>
+              <w:left w:type="dxa" w:w="90"/>
+              <w:bottom w:type="dxa" w:w="50"/>
+              <w:right w:type="dxa" w:w="90"/>
+            </w:tcMar>
+          </w:tcPr>
+          <w:p>
+            <w:r>
+              <w:rPr>
+                <w:b w:val="false"/>
+                <w:bCs w:val="false"/>
+                <w:color w:val="2B2B2B"/>
+                <w:sz w:val="19"/>
+                <w:szCs w:val="19"/>
+              </w:rPr>
+              <w:t xml:space="preserve">Share the work at conferences.</w:t>
+            </w:r>
+          </w:p>
+        </w:tc>
+      </w:tr>
+    </w:tbl>
     <w:p>
       <w:pPr>
         <w:pStyle w:val="Heading1"/>

</xml_diff>